<commit_message>
docs: alinhar documentação extensionista
</commit_message>
<xml_diff>
--- a/docs/metodologia_e_evidencias_petconecta.docx
+++ b/docs/metodologia_e_evidencias_petconecta.docx
@@ -19,7 +19,7 @@
         <w:spacing w:after="200"/>
       </w:pPr>
       <w:r>
-        <w:t>Seção acadêmica: Metodologia de Gerenciamento do Projeto e Evidências de Evolução</w:t>
+        <w:t>Seção acadêmica: Gestão do Projeto com Kanban e Evidências de Evolução</w:t>
       </w:r>
     </w:p>
     <w:p>
@@ -35,7 +35,7 @@
         <w:spacing w:after="200"/>
       </w:pPr>
       <w:r>
-        <w:t>Para o gerenciamento do projeto PetConecta, foi adotada uma abordagem incremental e iterativa, alinhada ao contexto acadêmico da Atividade Extensionista e ao histórico de desenvolvimento iniciado na etapa anterior. Essa metodologia foi escolhida por permitir evolução contínua da solução, com entregas progressivas, ajustes frequentes e melhoria da qualidade técnica e funcional ao longo do tempo.</w:t>
+        <w:t>Para o gerenciamento do projeto PetConecta, foi adotado o modelo Kanban, alinhado ao contexto acadêmico da Atividade Extensionista e ao histórico de desenvolvimento iniciado na etapa anterior. O Kanban foi escolhido por permitir visualizar o trabalho, organizar prioridades, acompanhar o andamento das tarefas e incorporar melhorias de forma contínua.</w:t>
       </w:r>
     </w:p>
     <w:p>
@@ -43,7 +43,7 @@
         <w:spacing w:after="200"/>
       </w:pPr>
       <w:r>
-        <w:t>Diferentemente de um modelo linear rígido, a abordagem incremental e iterativa possibilita construir o sistema em partes, validar resultados parciais e incorporar correções a cada ciclo. No caso do PetConecta, essa estratégia foi adequada porque o projeto exigiu refinamentos sucessivos de escopo, interface, segurança e organização dos dados, sem interromper o fluxo de desenvolvimento já em andamento desde a Extensionista I.</w:t>
+        <w:t>O quadro Kanban foi organizado nas colunas Backlog, Planejado, Em andamento, Em validação e Concluído. Cada atividade é representada por um cartão com objetivo, prioridade, evidência e critério de conclusão. O fluxo do quadro acompanha o diagrama de metodologia mais recente anexado ao modelo de proposta de tema: diagnóstico, objetivos e escopo, planejamento, requisitos e modelagem, implementação, testes, publicação, feedback, análise e refinamento final.</w:t>
       </w:r>
     </w:p>
     <w:p>
@@ -51,7 +51,7 @@
         <w:spacing w:after="200"/>
       </w:pPr>
       <w:r>
-        <w:t>A aplicação prática da metodologia ocorreu em ciclos curtos, compostos por quatro etapas principais:</w:t>
+        <w:t>A aplicação prática do Kanban ocorreu por meio de fluxo contínuo, com revisão dos cartões ao final de cada entrega:</w:t>
       </w:r>
     </w:p>
     <w:p>
@@ -59,7 +59,7 @@
         <w:spacing w:after="200"/>
       </w:pPr>
       <w:r>
-        <w:t>1) Planejamento do ciclo: definição dos objetivos imediatos, priorização de funcionalidades e identificação de riscos.</w:t>
+        <w:t>1) Backlog: registro das necessidades, requisitos, riscos e melhorias identificadas.</w:t>
       </w:r>
     </w:p>
     <w:p>
@@ -67,7 +67,7 @@
         <w:spacing w:after="200"/>
       </w:pPr>
       <w:r>
-        <w:t>2) Implementação: desenvolvimento ou ajuste de funcionalidades específicas, com foco em uma parte do sistema por vez.</w:t>
+        <w:t>2) Planejado: seleção e priorização dos cartões relacionados à etapa atual do diagrama.</w:t>
       </w:r>
     </w:p>
     <w:p>
@@ -75,7 +75,7 @@
         <w:spacing w:after="200"/>
       </w:pPr>
       <w:r>
-        <w:t>3) Validação: verificação funcional e técnica da entrega parcial, incluindo testes manuais de uso e análise de consistência dos dados.</w:t>
+        <w:t>3) Em andamento: execução de uma quantidade controlada de tarefas, evitando dispersão do trabalho.</w:t>
       </w:r>
     </w:p>
     <w:p>
@@ -83,7 +83,15 @@
         <w:spacing w:after="200"/>
       </w:pPr>
       <w:r>
-        <w:t>4) Refinamento: correção de falhas, melhoria de desempenho, revisão de segurança e atualização da documentação.</w:t>
+        <w:t>4) Em validação: realização de testes funcionais, revisão técnica, coleta de feedback e análise dos resultados.</w:t>
+      </w:r>
+    </w:p>
+    <w:p>
+      <w:pPr>
+        <w:spacing w:after="200"/>
+      </w:pPr>
+      <w:r>
+        <w:t>5) Concluído: entrega aceita, documentação atualizada e evidência registrada antes da passagem à próxima etapa.</w:t>
       </w:r>
     </w:p>
     <w:p>
@@ -107,7 +115,7 @@
         <w:spacing w:after="200"/>
       </w:pPr>
       <w:r>
-        <w:t>Em relação ao uso de frameworks específicos, destaca-se que o Kanban foi considerado como referência possível, mas não obrigatório. A escolha pela abordagem incremental e iterativa atende ao requisito da atividade por ser compatível com o tipo de projeto desenvolvido e com a dinâmica real de evolução adotada.</w:t>
+        <w:t>O Kanban é compatível com o fluxo do diagrama porque permite manter as etapas planejadas como referência sem transformar o desenvolvimento em um processo de cascata. Assim, o projeto pode avançar pelas dez etapas previstas e, quando a análise ou o feedback indicar melhorias, mover novos cartões para Planejado e retomar o trabalho de forma controlada.</w:t>
       </w:r>
     </w:p>
     <w:p>
@@ -115,7 +123,7 @@
         <w:spacing w:after="200"/>
       </w:pPr>
       <w:r>
-        <w:t>Conclui-se que a metodologia incremental e iterativa foi adequada ao PetConecta por permitir desenvolvimento progressivo, correções orientadas por validação contínua e fortalecimento da documentação do projeto. Essa escolha garantiu organização do trabalho, aderência aos objetivos da atividade extensionista e sustentação técnica para futuras evoluções do sistema.</w:t>
+        <w:t>Conclui-se que o Kanban foi adequado ao PetConecta por oferecer transparência do trabalho, priorização, controle do andamento e melhoria contínua. O método permanece alinhado ao cronograma de 16 semanas e 112 dias representado no diagrama mais recente, preservando as etapas de planejamento, desenvolvimento, validação, feedback, análise e refinamento.</w:t>
       </w:r>
     </w:p>
     <w:p>
@@ -131,7 +139,7 @@
         <w:spacing w:after="200"/>
       </w:pPr>
       <w:r>
-        <w:t>A evolução do PetConecta foi conduzida de forma incremental e iterativa, com entregas parciais e refinamentos sucessivos ao longo do desenvolvimento. Para demonstrar o gerenciamento do projeto, esta seção apresenta os principais ciclos de evolução, os problemas identificados em cada etapa, as ações executadas e os resultados obtidos.</w:t>
+        <w:t>A evolução do PetConecta foi conduzida por um fluxo Kanban, com cartões priorizados, entregas parciais e refinamentos sucessivos ao longo do desenvolvimento. Para demonstrar o gerenciamento do projeto, esta seção apresenta os principais ciclos de evolução, os problemas identificados em cada etapa, as ações executadas e os resultados obtidos.</w:t>
       </w:r>
     </w:p>
     <w:p>
@@ -139,7 +147,7 @@
         <w:spacing w:after="200"/>
       </w:pPr>
       <w:r>
-        <w:t>As evidências documentais que sustentam essa evolução estão registradas em README.md, docs/modelagem-site.md, docs/arquitetura.md e docs/riscos-e-mitigacoes.md, além do histórico de versões no GitHub.</w:t>
+        <w:t>As evidências documentais que sustentam essa evolução estão registradas em README.md, docs/modelagem-site.md e docs/arquitetura.md, além do histórico de versões no GitHub. O controle de riscos é mantido como parte dos cartões do backlog e das revisões de validação.</w:t>
       </w:r>
     </w:p>
     <w:tbl>
@@ -164,7 +172,7 @@
           </w:tcPr>
           <w:p>
             <w:r>
-              <w:t>Ciclo</w:t>
+              <w:t>Etapa do Kanban</w:t>
             </w:r>
           </w:p>
         </w:tc>
@@ -236,7 +244,7 @@
           </w:tcPr>
           <w:p>
             <w:r>
-              <w:t>1</w:t>
+              <w:t>1 - Backlog</w:t>
             </w:r>
           </w:p>
         </w:tc>
@@ -246,7 +254,7 @@
           </w:tcPr>
           <w:p>
             <w:r>
-              <w:t>Extensionista I</w:t>
+              <w:t>Diagnóstico do problema (7 dias)</w:t>
             </w:r>
           </w:p>
         </w:tc>
@@ -308,7 +316,7 @@
           </w:tcPr>
           <w:p>
             <w:r>
-              <w:t>2</w:t>
+              <w:t>2 - Planejado</w:t>
             </w:r>
           </w:p>
         </w:tc>
@@ -318,7 +326,7 @@
           </w:tcPr>
           <w:p>
             <w:r>
-              <w:t>Início da Extensionista II</w:t>
+              <w:t>Objetivos e escopo (5 dias)</w:t>
             </w:r>
           </w:p>
         </w:tc>
@@ -380,7 +388,7 @@
           </w:tcPr>
           <w:p>
             <w:r>
-              <w:t>3</w:t>
+              <w:t>3 - Em andamento</w:t>
             </w:r>
           </w:p>
         </w:tc>
@@ -390,7 +398,7 @@
           </w:tcPr>
           <w:p>
             <w:r>
-              <w:t>Desenvolvimento intermediário</w:t>
+              <w:t>Planejamento: WBS, recursos, riscos e qualidade (10 dias)</w:t>
             </w:r>
           </w:p>
         </w:tc>
@@ -452,7 +460,7 @@
           </w:tcPr>
           <w:p>
             <w:r>
-              <w:t>4</w:t>
+              <w:t>4 - Em andamento</w:t>
             </w:r>
           </w:p>
         </w:tc>
@@ -462,7 +470,7 @@
           </w:tcPr>
           <w:p>
             <w:r>
-              <w:t>Desenvolvimento intermediário</w:t>
+              <w:t>Requisitos e modelagem (14 dias)</w:t>
             </w:r>
           </w:p>
         </w:tc>
@@ -524,7 +532,7 @@
           </w:tcPr>
           <w:p>
             <w:r>
-              <w:t>5</w:t>
+              <w:t>5 - Em andamento</w:t>
             </w:r>
           </w:p>
         </w:tc>
@@ -534,7 +542,7 @@
           </w:tcPr>
           <w:p>
             <w:r>
-              <w:t>Desenvolvimento avançado</w:t>
+              <w:t>Implementação do protótipo (28 dias)</w:t>
             </w:r>
           </w:p>
         </w:tc>
@@ -596,7 +604,7 @@
           </w:tcPr>
           <w:p>
             <w:r>
-              <w:t>6</w:t>
+              <w:t>6 - Em validação</w:t>
             </w:r>
           </w:p>
         </w:tc>
@@ -606,7 +614,7 @@
           </w:tcPr>
           <w:p>
             <w:r>
-              <w:t>Fase de consolidação</w:t>
+              <w:t>Testes funcionais, usabilidade e acessibilidade (14 dias)</w:t>
             </w:r>
           </w:p>
         </w:tc>
@@ -668,7 +676,7 @@
           </w:tcPr>
           <w:p>
             <w:r>
-              <w:t>7</w:t>
+              <w:t>7 - Em validação</w:t>
             </w:r>
           </w:p>
         </w:tc>
@@ -678,7 +686,7 @@
           </w:tcPr>
           <w:p>
             <w:r>
-              <w:t>Entrega final</w:t>
+              <w:t>Publicação e demonstração do protótipo (7 dias)</w:t>
             </w:r>
           </w:p>
         </w:tc>
@@ -733,6 +741,222 @@
           </w:p>
         </w:tc>
       </w:tr>
+      <w:tr>
+        <w:tc>
+          <w:tcPr>
+            <w:tcW w:type="dxa" w:w="1234"/>
+          </w:tcPr>
+          <w:p>
+            <w:r>
+              <w:t>8 - Em validação</w:t>
+            </w:r>
+          </w:p>
+        </w:tc>
+        <w:tc>
+          <w:tcPr>
+            <w:tcW w:type="dxa" w:w="1234"/>
+          </w:tcPr>
+          <w:p>
+            <w:r>
+              <w:t>Coleta de feedback comunitário (14 dias)</w:t>
+            </w:r>
+          </w:p>
+        </w:tc>
+        <w:tc>
+          <w:tcPr>
+            <w:tcW w:type="dxa" w:w="1234"/>
+          </w:tcPr>
+          <w:p>
+            <w:r>
+              <w:t>Obter retorno de usuários e ONGs</w:t>
+            </w:r>
+          </w:p>
+        </w:tc>
+        <w:tc>
+          <w:tcPr>
+            <w:tcW w:type="dxa" w:w="1234"/>
+          </w:tcPr>
+          <w:p>
+            <w:r>
+              <w:t>Necessidade de validar a utilidade prática</w:t>
+            </w:r>
+          </w:p>
+        </w:tc>
+        <w:tc>
+          <w:tcPr>
+            <w:tcW w:type="dxa" w:w="1234"/>
+          </w:tcPr>
+          <w:p>
+            <w:r>
+              <w:t>Aplicação de formulário e registro das respostas</w:t>
+            </w:r>
+          </w:p>
+        </w:tc>
+        <w:tc>
+          <w:tcPr>
+            <w:tcW w:type="dxa" w:w="1234"/>
+          </w:tcPr>
+          <w:p>
+            <w:r>
+              <w:t>docs/roteiro-google-form-impacto.md</w:t>
+            </w:r>
+          </w:p>
+        </w:tc>
+        <w:tc>
+          <w:tcPr>
+            <w:tcW w:type="dxa" w:w="1234"/>
+          </w:tcPr>
+          <w:p>
+            <w:r>
+              <w:t>Feedback organizado para análise</w:t>
+            </w:r>
+          </w:p>
+        </w:tc>
+      </w:tr>
+      <w:tr>
+        <w:tc>
+          <w:tcPr>
+            <w:tcW w:type="dxa" w:w="1234"/>
+          </w:tcPr>
+          <w:p>
+            <w:r>
+              <w:t>9 - Em validação</w:t>
+            </w:r>
+          </w:p>
+        </w:tc>
+        <w:tc>
+          <w:tcPr>
+            <w:tcW w:type="dxa" w:w="1234"/>
+          </w:tcPr>
+          <w:p>
+            <w:r>
+              <w:t>Análise das respostas (5 dias)</w:t>
+            </w:r>
+          </w:p>
+        </w:tc>
+        <w:tc>
+          <w:tcPr>
+            <w:tcW w:type="dxa" w:w="1234"/>
+          </w:tcPr>
+          <w:p>
+            <w:r>
+              <w:t>Interpretar os dados coletados</w:t>
+            </w:r>
+          </w:p>
+        </w:tc>
+        <w:tc>
+          <w:tcPr>
+            <w:tcW w:type="dxa" w:w="1234"/>
+          </w:tcPr>
+          <w:p>
+            <w:r>
+              <w:t>Necessidade de identificar melhorias prioritárias</w:t>
+            </w:r>
+          </w:p>
+        </w:tc>
+        <w:tc>
+          <w:tcPr>
+            <w:tcW w:type="dxa" w:w="1234"/>
+          </w:tcPr>
+          <w:p>
+            <w:r>
+              <w:t>Consolidação e análise dos resultados</w:t>
+            </w:r>
+          </w:p>
+        </w:tc>
+        <w:tc>
+          <w:tcPr>
+            <w:tcW w:type="dxa" w:w="1234"/>
+          </w:tcPr>
+          <w:p>
+            <w:r>
+              <w:t>Evidências da coleta e formulário</w:t>
+            </w:r>
+          </w:p>
+        </w:tc>
+        <w:tc>
+          <w:tcPr>
+            <w:tcW w:type="dxa" w:w="1234"/>
+          </w:tcPr>
+          <w:p>
+            <w:r>
+              <w:t>Melhorias priorizadas</w:t>
+            </w:r>
+          </w:p>
+        </w:tc>
+      </w:tr>
+      <w:tr>
+        <w:tc>
+          <w:tcPr>
+            <w:tcW w:type="dxa" w:w="1234"/>
+          </w:tcPr>
+          <w:p>
+            <w:r>
+              <w:t>10 - Concluído</w:t>
+            </w:r>
+          </w:p>
+        </w:tc>
+        <w:tc>
+          <w:tcPr>
+            <w:tcW w:type="dxa" w:w="1234"/>
+          </w:tcPr>
+          <w:p>
+            <w:r>
+              <w:t>Refinamento e evidências finais (8 dias)</w:t>
+            </w:r>
+          </w:p>
+        </w:tc>
+        <w:tc>
+          <w:tcPr>
+            <w:tcW w:type="dxa" w:w="1234"/>
+          </w:tcPr>
+          <w:p>
+            <w:r>
+              <w:t>Consolidar a entrega do projeto</w:t>
+            </w:r>
+          </w:p>
+        </w:tc>
+        <w:tc>
+          <w:tcPr>
+            <w:tcW w:type="dxa" w:w="1234"/>
+          </w:tcPr>
+          <w:p>
+            <w:r>
+              <w:t>Necessidade de fechar documentação e ajustes</w:t>
+            </w:r>
+          </w:p>
+        </w:tc>
+        <w:tc>
+          <w:tcPr>
+            <w:tcW w:type="dxa" w:w="1234"/>
+          </w:tcPr>
+          <w:p>
+            <w:r>
+              <w:t>Correções finais, atualização documental e organização das evidências</w:t>
+            </w:r>
+          </w:p>
+        </w:tc>
+        <w:tc>
+          <w:tcPr>
+            <w:tcW w:type="dxa" w:w="1234"/>
+          </w:tcPr>
+          <w:p>
+            <w:r>
+              <w:t>README.md e documentação do projeto</w:t>
+            </w:r>
+          </w:p>
+        </w:tc>
+        <w:tc>
+          <w:tcPr>
+            <w:tcW w:type="dxa" w:w="1234"/>
+          </w:tcPr>
+          <w:p>
+            <w:r>
+              <w:t>Entrega final preparada</w:t>
+            </w:r>
+          </w:p>
+        </w:tc>
+      </w:tr>
     </w:tbl>
     <w:p>
       <w:pPr>
@@ -747,7 +971,7 @@
         <w:spacing w:after="200"/>
       </w:pPr>
       <w:r>
-        <w:t>Os ciclos apresentados evidenciam que o projeto não foi desenvolvido em etapa única, mas sim em progressão contínua, com decisões orientadas por validação prática e necessidade real de ajuste. Esse comportamento é aderente à metodologia incremental e iterativa adotada no gerenciamento, pois cada ciclo agregou valor funcional e técnico ao sistema.</w:t>
+        <w:t>As etapas e movimentações dos cartões evidenciam que o projeto não foi desenvolvido em etapa única, mas sim em progressão contínua, com decisões orientadas por validação prática e necessidade real de ajuste. Esse comportamento é aderente ao Kanban adotado no gerenciamento, pois cada ciclo agregou valor funcional e técnico ao sistema.</w:t>
       </w:r>
     </w:p>
     <w:p>
@@ -771,7 +995,7 @@
         <w:spacing w:after="200"/>
       </w:pPr>
       <w:r>
-        <w:t>As evidências de evolução confirmam que o PetConecta foi gerenciado com método, mesmo sem adoção obrigatória de um framework único como Kanban. A organização por ciclos, com documentação técnica e histórico de versão, comprova a estruturação do trabalho e a maturidade progressiva da solução desenvolvida.</w:t>
+        <w:t>As evidências de evolução confirmam que o PetConecta foi gerenciado com Kanban. A organização visual por etapas, com documentação técnica, prioridades, validações e histórico de versões, comprova a estruturação do trabalho e a maturidade progressiva da solução desenvolvida.</w:t>
       </w:r>
     </w:p>
     <w:p>

</xml_diff>

<commit_message>
docs: atualizar modelagem e metodologia do projeto
</commit_message>
<xml_diff>
--- a/docs/metodologia_e_evidencias_petconecta.docx
+++ b/docs/metodologia_e_evidencias_petconecta.docx
@@ -43,7 +43,7 @@
         <w:spacing w:after="200"/>
       </w:pPr>
       <w:r>
-        <w:t>O quadro Kanban foi organizado nas colunas Backlog, Planejado, Em andamento, Em validação e Concluído. Cada atividade é representada por um cartão com objetivo, prioridade, evidência e critério de conclusão. O fluxo do quadro acompanha o diagrama de metodologia mais recente anexado ao modelo de proposta de tema: diagnóstico, objetivos e escopo, planejamento, requisitos e modelagem, implementação, testes, publicação, feedback, análise e refinamento final.</w:t>
+        <w:t>O quadro Kanban foi organizado nas colunas Backlog, Planejado, Em andamento, Em validação e Concluído. Cada atividade é representada por um cartão com objetivo, prioridade, evidência e critério de conclusão. O fluxo do quadro acompanha o diagrama de metodologia mais recente anexado ao modelo de proposta de tema: levantamento do setor de aplicação, levantamento de requisitos, análise dos requisitos, versão navegável, implementação e integração tecnológica, testes, publicação, feedback, análise e refinamento final.</w:t>
       </w:r>
     </w:p>
     <w:p>
@@ -123,7 +123,7 @@
         <w:spacing w:after="200"/>
       </w:pPr>
       <w:r>
-        <w:t>Conclui-se que o Kanban foi adequado ao PetConecta por oferecer transparência do trabalho, priorização, controle do andamento e melhoria contínua. O método permanece alinhado ao cronograma de 16 semanas e 112 dias representado no diagrama mais recente, preservando as etapas de planejamento, desenvolvimento, validação, feedback, análise e refinamento.</w:t>
+        <w:t>Conclui-se que o Kanban foi adequado ao PetConecta por oferecer transparência do trabalho, priorização, controle do andamento e melhoria contínua. O método permanece alinhado ao cronograma de 107 dias representado no diagrama mais recente, preservando as etapas de levantamento, desenvolvimento, validação, feedback, análise e refinamento.</w:t>
       </w:r>
     </w:p>
     <w:p>
@@ -157,81 +157,151 @@
         <w:tblLook w:firstColumn="1" w:firstRow="1" w:lastColumn="0" w:lastRow="0" w:noHBand="0" w:noVBand="1" w:val="04A0"/>
       </w:tblPr>
       <w:tblGrid>
-        <w:gridCol w:w="1234"/>
-        <w:gridCol w:w="1234"/>
-        <w:gridCol w:w="1234"/>
-        <w:gridCol w:w="1234"/>
-        <w:gridCol w:w="1234"/>
-        <w:gridCol w:w="1234"/>
-        <w:gridCol w:w="1234"/>
+        <w:gridCol w:w="2057"/>
+        <w:gridCol w:w="2057"/>
+        <w:gridCol w:w="2057"/>
+        <w:gridCol w:w="2057"/>
+        <w:gridCol w:w="2057"/>
+        <w:gridCol w:w="2057"/>
+        <w:gridCol w:w="2057"/>
       </w:tblGrid>
       <w:tr>
         <w:tc>
           <w:tcPr>
-            <w:tcW w:type="dxa" w:w="1234"/>
+            <w:tcW w:type="dxa" w:w="2057"/>
+            <w:vAlign w:val="center"/>
+            <w:tcMar>
+              <w:top w:w="80" w:type="dxa"/>
+              <w:start w:w="100" w:type="dxa"/>
+              <w:bottom w:w="80" w:type="dxa"/>
+              <w:end w:w="100" w:type="dxa"/>
+            </w:tcMar>
           </w:tcPr>
           <w:p>
             <w:r>
+              <w:rPr>
+                <w:sz w:val="16"/>
+              </w:rPr>
               <w:t>Etapa do Kanban</w:t>
             </w:r>
           </w:p>
         </w:tc>
         <w:tc>
           <w:tcPr>
-            <w:tcW w:type="dxa" w:w="1234"/>
+            <w:tcW w:type="dxa" w:w="2057"/>
+            <w:vAlign w:val="center"/>
+            <w:tcMar>
+              <w:top w:w="80" w:type="dxa"/>
+              <w:start w:w="100" w:type="dxa"/>
+              <w:bottom w:w="80" w:type="dxa"/>
+              <w:end w:w="100" w:type="dxa"/>
+            </w:tcMar>
           </w:tcPr>
           <w:p>
             <w:r>
+              <w:rPr>
+                <w:sz w:val="16"/>
+              </w:rPr>
               <w:t>Período</w:t>
             </w:r>
           </w:p>
         </w:tc>
         <w:tc>
           <w:tcPr>
-            <w:tcW w:type="dxa" w:w="1234"/>
+            <w:tcW w:type="dxa" w:w="2057"/>
+            <w:vAlign w:val="center"/>
+            <w:tcMar>
+              <w:top w:w="80" w:type="dxa"/>
+              <w:start w:w="100" w:type="dxa"/>
+              <w:bottom w:w="80" w:type="dxa"/>
+              <w:end w:w="100" w:type="dxa"/>
+            </w:tcMar>
           </w:tcPr>
           <w:p>
             <w:r>
+              <w:rPr>
+                <w:sz w:val="16"/>
+              </w:rPr>
               <w:t>Objetivo do Ciclo</w:t>
             </w:r>
           </w:p>
         </w:tc>
         <w:tc>
           <w:tcPr>
-            <w:tcW w:type="dxa" w:w="1234"/>
+            <w:tcW w:type="dxa" w:w="2057"/>
+            <w:vAlign w:val="center"/>
+            <w:tcMar>
+              <w:top w:w="80" w:type="dxa"/>
+              <w:start w:w="100" w:type="dxa"/>
+              <w:bottom w:w="80" w:type="dxa"/>
+              <w:end w:w="100" w:type="dxa"/>
+            </w:tcMar>
           </w:tcPr>
           <w:p>
             <w:r>
+              <w:rPr>
+                <w:sz w:val="16"/>
+              </w:rPr>
               <w:t>Problema identificado</w:t>
             </w:r>
           </w:p>
         </w:tc>
         <w:tc>
           <w:tcPr>
-            <w:tcW w:type="dxa" w:w="1234"/>
+            <w:tcW w:type="dxa" w:w="2057"/>
+            <w:vAlign w:val="center"/>
+            <w:tcMar>
+              <w:top w:w="80" w:type="dxa"/>
+              <w:start w:w="100" w:type="dxa"/>
+              <w:bottom w:w="80" w:type="dxa"/>
+              <w:end w:w="100" w:type="dxa"/>
+            </w:tcMar>
           </w:tcPr>
           <w:p>
             <w:r>
+              <w:rPr>
+                <w:sz w:val="16"/>
+              </w:rPr>
               <w:t>Ação executada</w:t>
             </w:r>
           </w:p>
         </w:tc>
         <w:tc>
           <w:tcPr>
-            <w:tcW w:type="dxa" w:w="1234"/>
+            <w:tcW w:type="dxa" w:w="2057"/>
+            <w:vAlign w:val="center"/>
+            <w:tcMar>
+              <w:top w:w="80" w:type="dxa"/>
+              <w:start w:w="100" w:type="dxa"/>
+              <w:bottom w:w="80" w:type="dxa"/>
+              <w:end w:w="100" w:type="dxa"/>
+            </w:tcMar>
           </w:tcPr>
           <w:p>
             <w:r>
+              <w:rPr>
+                <w:sz w:val="16"/>
+              </w:rPr>
               <w:t>Evidência documental</w:t>
             </w:r>
           </w:p>
         </w:tc>
         <w:tc>
           <w:tcPr>
-            <w:tcW w:type="dxa" w:w="1234"/>
+            <w:tcW w:type="dxa" w:w="2057"/>
+            <w:vAlign w:val="center"/>
+            <w:tcMar>
+              <w:top w:w="80" w:type="dxa"/>
+              <w:start w:w="100" w:type="dxa"/>
+              <w:bottom w:w="80" w:type="dxa"/>
+              <w:end w:w="100" w:type="dxa"/>
+            </w:tcMar>
           </w:tcPr>
           <w:p>
             <w:r>
+              <w:rPr>
+                <w:sz w:val="16"/>
+              </w:rPr>
               <w:t>Resultado</w:t>
             </w:r>
           </w:p>
@@ -240,70 +310,161 @@
       <w:tr>
         <w:tc>
           <w:tcPr>
-            <w:tcW w:type="dxa" w:w="1234"/>
+            <w:tcW w:type="dxa" w:w="2057"/>
+            <w:vAlign w:val="center"/>
+            <w:tcMar>
+              <w:top w:w="80" w:type="dxa"/>
+              <w:start w:w="100" w:type="dxa"/>
+              <w:bottom w:w="80" w:type="dxa"/>
+              <w:end w:w="100" w:type="dxa"/>
+            </w:tcMar>
           </w:tcPr>
           <w:p>
+            <w:pPr>
+              <w:spacing w:after="0"/>
+            </w:pPr>
             <w:r>
+              <w:rPr>
+                <w:sz w:val="14"/>
+              </w:rPr>
               <w:t>1 - Backlog</w:t>
             </w:r>
           </w:p>
         </w:tc>
         <w:tc>
           <w:tcPr>
-            <w:tcW w:type="dxa" w:w="1234"/>
+            <w:tcW w:type="dxa" w:w="2057"/>
+            <w:vAlign w:val="center"/>
+            <w:tcMar>
+              <w:top w:w="80" w:type="dxa"/>
+              <w:start w:w="100" w:type="dxa"/>
+              <w:bottom w:w="80" w:type="dxa"/>
+              <w:end w:w="100" w:type="dxa"/>
+            </w:tcMar>
           </w:tcPr>
           <w:p>
+            <w:pPr>
+              <w:spacing w:after="0"/>
+            </w:pPr>
             <w:r>
-              <w:t>Diagnóstico do problema (7 dias)</w:t>
+              <w:rPr>
+                <w:sz w:val="14"/>
+              </w:rPr>
+              <w:t>Levantamento do setor de aplicação (10 dias)</w:t>
             </w:r>
           </w:p>
         </w:tc>
         <w:tc>
           <w:tcPr>
-            <w:tcW w:type="dxa" w:w="1234"/>
+            <w:tcW w:type="dxa" w:w="2057"/>
+            <w:vAlign w:val="center"/>
+            <w:tcMar>
+              <w:top w:w="80" w:type="dxa"/>
+              <w:start w:w="100" w:type="dxa"/>
+              <w:bottom w:w="80" w:type="dxa"/>
+              <w:end w:w="100" w:type="dxa"/>
+            </w:tcMar>
           </w:tcPr>
           <w:p>
+            <w:pPr>
+              <w:spacing w:after="0"/>
+            </w:pPr>
             <w:r>
+              <w:rPr>
+                <w:sz w:val="14"/>
+              </w:rPr>
               <w:t>Estruturar a base do sistema</w:t>
             </w:r>
           </w:p>
         </w:tc>
         <w:tc>
           <w:tcPr>
-            <w:tcW w:type="dxa" w:w="1234"/>
+            <w:tcW w:type="dxa" w:w="2057"/>
+            <w:vAlign w:val="center"/>
+            <w:tcMar>
+              <w:top w:w="80" w:type="dxa"/>
+              <w:start w:w="100" w:type="dxa"/>
+              <w:bottom w:w="80" w:type="dxa"/>
+              <w:end w:w="100" w:type="dxa"/>
+            </w:tcMar>
           </w:tcPr>
           <w:p>
+            <w:pPr>
+              <w:spacing w:after="0"/>
+            </w:pPr>
             <w:r>
+              <w:rPr>
+                <w:sz w:val="14"/>
+              </w:rPr>
               <w:t>Necessidade de centralizar a proposta da solução</w:t>
             </w:r>
           </w:p>
         </w:tc>
         <w:tc>
           <w:tcPr>
-            <w:tcW w:type="dxa" w:w="1234"/>
+            <w:tcW w:type="dxa" w:w="2057"/>
+            <w:vAlign w:val="center"/>
+            <w:tcMar>
+              <w:top w:w="80" w:type="dxa"/>
+              <w:start w:w="100" w:type="dxa"/>
+              <w:bottom w:w="80" w:type="dxa"/>
+              <w:end w:w="100" w:type="dxa"/>
+            </w:tcMar>
           </w:tcPr>
           <w:p>
+            <w:pPr>
+              <w:spacing w:after="0"/>
+            </w:pPr>
             <w:r>
+              <w:rPr>
+                <w:sz w:val="14"/>
+              </w:rPr>
               <w:t>Definição do escopo inicial e estrutura do site</w:t>
             </w:r>
           </w:p>
         </w:tc>
         <w:tc>
           <w:tcPr>
-            <w:tcW w:type="dxa" w:w="1234"/>
+            <w:tcW w:type="dxa" w:w="2057"/>
+            <w:vAlign w:val="center"/>
+            <w:tcMar>
+              <w:top w:w="80" w:type="dxa"/>
+              <w:start w:w="100" w:type="dxa"/>
+              <w:bottom w:w="80" w:type="dxa"/>
+              <w:end w:w="100" w:type="dxa"/>
+            </w:tcMar>
           </w:tcPr>
           <w:p>
+            <w:pPr>
+              <w:spacing w:after="0"/>
+            </w:pPr>
             <w:r>
+              <w:rPr>
+                <w:sz w:val="14"/>
+              </w:rPr>
               <w:t>Modelagem inicial e primeira versão no GitHub</w:t>
             </w:r>
           </w:p>
         </w:tc>
         <w:tc>
           <w:tcPr>
-            <w:tcW w:type="dxa" w:w="1234"/>
+            <w:tcW w:type="dxa" w:w="2057"/>
+            <w:vAlign w:val="center"/>
+            <w:tcMar>
+              <w:top w:w="80" w:type="dxa"/>
+              <w:start w:w="100" w:type="dxa"/>
+              <w:bottom w:w="80" w:type="dxa"/>
+              <w:end w:w="100" w:type="dxa"/>
+            </w:tcMar>
           </w:tcPr>
           <w:p>
+            <w:pPr>
+              <w:spacing w:after="0"/>
+            </w:pPr>
             <w:r>
+              <w:rPr>
+                <w:sz w:val="14"/>
+              </w:rPr>
               <w:t>Base funcional do projeto estabelecida</w:t>
             </w:r>
           </w:p>
@@ -312,71 +473,162 @@
       <w:tr>
         <w:tc>
           <w:tcPr>
-            <w:tcW w:type="dxa" w:w="1234"/>
+            <w:tcW w:type="dxa" w:w="2057"/>
+            <w:vAlign w:val="center"/>
+            <w:tcMar>
+              <w:top w:w="80" w:type="dxa"/>
+              <w:start w:w="100" w:type="dxa"/>
+              <w:bottom w:w="80" w:type="dxa"/>
+              <w:end w:w="100" w:type="dxa"/>
+            </w:tcMar>
           </w:tcPr>
           <w:p>
+            <w:pPr>
+              <w:spacing w:after="0"/>
+            </w:pPr>
             <w:r>
+              <w:rPr>
+                <w:sz w:val="14"/>
+              </w:rPr>
               <w:t>2 - Planejado</w:t>
             </w:r>
           </w:p>
         </w:tc>
         <w:tc>
           <w:tcPr>
-            <w:tcW w:type="dxa" w:w="1234"/>
+            <w:tcW w:type="dxa" w:w="2057"/>
+            <w:vAlign w:val="center"/>
+            <w:tcMar>
+              <w:top w:w="80" w:type="dxa"/>
+              <w:start w:w="100" w:type="dxa"/>
+              <w:bottom w:w="80" w:type="dxa"/>
+              <w:end w:w="100" w:type="dxa"/>
+            </w:tcMar>
           </w:tcPr>
           <w:p>
+            <w:pPr>
+              <w:spacing w:after="0"/>
+            </w:pPr>
             <w:r>
-              <w:t>Objetivos e escopo (5 dias)</w:t>
+              <w:rPr>
+                <w:sz w:val="14"/>
+              </w:rPr>
+              <w:t>Levantamento de requisitos (7 dias)</w:t>
             </w:r>
           </w:p>
         </w:tc>
         <w:tc>
           <w:tcPr>
-            <w:tcW w:type="dxa" w:w="1234"/>
+            <w:tcW w:type="dxa" w:w="2057"/>
+            <w:vAlign w:val="center"/>
+            <w:tcMar>
+              <w:top w:w="80" w:type="dxa"/>
+              <w:start w:w="100" w:type="dxa"/>
+              <w:bottom w:w="80" w:type="dxa"/>
+              <w:end w:w="100" w:type="dxa"/>
+            </w:tcMar>
           </w:tcPr>
           <w:p>
+            <w:pPr>
+              <w:spacing w:after="0"/>
+            </w:pPr>
             <w:r>
-              <w:t>Consolidar arquitetura técnica</w:t>
+              <w:rPr>
+                <w:sz w:val="14"/>
+              </w:rPr>
+              <w:t>Consolidar as necessidades do sistema</w:t>
             </w:r>
           </w:p>
         </w:tc>
         <w:tc>
           <w:tcPr>
-            <w:tcW w:type="dxa" w:w="1234"/>
+            <w:tcW w:type="dxa" w:w="2057"/>
+            <w:vAlign w:val="center"/>
+            <w:tcMar>
+              <w:top w:w="80" w:type="dxa"/>
+              <w:start w:w="100" w:type="dxa"/>
+              <w:bottom w:w="80" w:type="dxa"/>
+              <w:end w:w="100" w:type="dxa"/>
+            </w:tcMar>
           </w:tcPr>
           <w:p>
+            <w:pPr>
+              <w:spacing w:after="0"/>
+            </w:pPr>
             <w:r>
-              <w:t>Organização técnica dispersa entre funcionalidades</w:t>
+              <w:rPr>
+                <w:sz w:val="14"/>
+              </w:rPr>
+              <w:t>Necessidade de traduzir o problema em funcionalidades</w:t>
             </w:r>
           </w:p>
         </w:tc>
         <w:tc>
           <w:tcPr>
-            <w:tcW w:type="dxa" w:w="1234"/>
+            <w:tcW w:type="dxa" w:w="2057"/>
+            <w:vAlign w:val="center"/>
+            <w:tcMar>
+              <w:top w:w="80" w:type="dxa"/>
+              <w:start w:w="100" w:type="dxa"/>
+              <w:bottom w:w="80" w:type="dxa"/>
+              <w:end w:w="100" w:type="dxa"/>
+            </w:tcMar>
           </w:tcPr>
           <w:p>
+            <w:pPr>
+              <w:spacing w:after="0"/>
+            </w:pPr>
             <w:r>
-              <w:t>Revisão da arquitetura e padronização dos componentes</w:t>
+              <w:rPr>
+                <w:sz w:val="14"/>
+              </w:rPr>
+              <w:t>Registro dos requisitos funcionais, não funcionais e dos perfis de usuário</w:t>
             </w:r>
           </w:p>
         </w:tc>
         <w:tc>
           <w:tcPr>
-            <w:tcW w:type="dxa" w:w="1234"/>
+            <w:tcW w:type="dxa" w:w="2057"/>
+            <w:vAlign w:val="center"/>
+            <w:tcMar>
+              <w:top w:w="80" w:type="dxa"/>
+              <w:start w:w="100" w:type="dxa"/>
+              <w:bottom w:w="80" w:type="dxa"/>
+              <w:end w:w="100" w:type="dxa"/>
+            </w:tcMar>
           </w:tcPr>
           <w:p>
+            <w:pPr>
+              <w:spacing w:after="0"/>
+            </w:pPr>
             <w:r>
-              <w:t>docs/arquitetura.md</w:t>
+              <w:rPr>
+                <w:sz w:val="14"/>
+              </w:rPr>
+              <w:t>docs/modelagem-site.md</w:t>
             </w:r>
           </w:p>
         </w:tc>
         <w:tc>
           <w:tcPr>
-            <w:tcW w:type="dxa" w:w="1234"/>
+            <w:tcW w:type="dxa" w:w="2057"/>
+            <w:vAlign w:val="center"/>
+            <w:tcMar>
+              <w:top w:w="80" w:type="dxa"/>
+              <w:start w:w="100" w:type="dxa"/>
+              <w:bottom w:w="80" w:type="dxa"/>
+              <w:end w:w="100" w:type="dxa"/>
+            </w:tcMar>
           </w:tcPr>
           <w:p>
+            <w:pPr>
+              <w:spacing w:after="0"/>
+            </w:pPr>
             <w:r>
-              <w:t>Maior clareza estrutural e manutenção facilitada</w:t>
+              <w:rPr>
+                <w:sz w:val="14"/>
+              </w:rPr>
+              <w:t>Escopo funcional documentado</w:t>
             </w:r>
           </w:p>
         </w:tc>
@@ -384,71 +636,162 @@
       <w:tr>
         <w:tc>
           <w:tcPr>
-            <w:tcW w:type="dxa" w:w="1234"/>
+            <w:tcW w:type="dxa" w:w="2057"/>
+            <w:vAlign w:val="center"/>
+            <w:tcMar>
+              <w:top w:w="80" w:type="dxa"/>
+              <w:start w:w="100" w:type="dxa"/>
+              <w:bottom w:w="80" w:type="dxa"/>
+              <w:end w:w="100" w:type="dxa"/>
+            </w:tcMar>
           </w:tcPr>
           <w:p>
+            <w:pPr>
+              <w:spacing w:after="0"/>
+            </w:pPr>
             <w:r>
+              <w:rPr>
+                <w:sz w:val="14"/>
+              </w:rPr>
               <w:t>3 - Em andamento</w:t>
             </w:r>
           </w:p>
         </w:tc>
         <w:tc>
           <w:tcPr>
-            <w:tcW w:type="dxa" w:w="1234"/>
+            <w:tcW w:type="dxa" w:w="2057"/>
+            <w:vAlign w:val="center"/>
+            <w:tcMar>
+              <w:top w:w="80" w:type="dxa"/>
+              <w:start w:w="100" w:type="dxa"/>
+              <w:bottom w:w="80" w:type="dxa"/>
+              <w:end w:w="100" w:type="dxa"/>
+            </w:tcMar>
           </w:tcPr>
           <w:p>
+            <w:pPr>
+              <w:spacing w:after="0"/>
+            </w:pPr>
             <w:r>
-              <w:t>Planejamento: WBS, recursos, riscos e qualidade (10 dias)</w:t>
+              <w:rPr>
+                <w:sz w:val="14"/>
+              </w:rPr>
+              <w:t>Análise dos requisitos (6 dias)</w:t>
             </w:r>
           </w:p>
         </w:tc>
         <w:tc>
           <w:tcPr>
-            <w:tcW w:type="dxa" w:w="1234"/>
+            <w:tcW w:type="dxa" w:w="2057"/>
+            <w:vAlign w:val="center"/>
+            <w:tcMar>
+              <w:top w:w="80" w:type="dxa"/>
+              <w:start w:w="100" w:type="dxa"/>
+              <w:bottom w:w="80" w:type="dxa"/>
+              <w:end w:w="100" w:type="dxa"/>
+            </w:tcMar>
           </w:tcPr>
           <w:p>
+            <w:pPr>
+              <w:spacing w:after="0"/>
+            </w:pPr>
             <w:r>
-              <w:t>Melhorar persistência e consultas</w:t>
+              <w:rPr>
+                <w:sz w:val="14"/>
+              </w:rPr>
+              <w:t>Validar prioridades, riscos e viabilidade</w:t>
             </w:r>
           </w:p>
         </w:tc>
         <w:tc>
           <w:tcPr>
-            <w:tcW w:type="dxa" w:w="1234"/>
+            <w:tcW w:type="dxa" w:w="2057"/>
+            <w:vAlign w:val="center"/>
+            <w:tcMar>
+              <w:top w:w="80" w:type="dxa"/>
+              <w:start w:w="100" w:type="dxa"/>
+              <w:bottom w:w="80" w:type="dxa"/>
+              <w:end w:w="100" w:type="dxa"/>
+            </w:tcMar>
           </w:tcPr>
           <w:p>
+            <w:pPr>
+              <w:spacing w:after="0"/>
+            </w:pPr>
             <w:r>
-              <w:t>Crescimento de dados com risco de perda de desempenho</w:t>
+              <w:rPr>
+                <w:sz w:val="14"/>
+              </w:rPr>
+              <w:t>Requisitos amplos e necessidade de priorização</w:t>
             </w:r>
           </w:p>
         </w:tc>
         <w:tc>
           <w:tcPr>
-            <w:tcW w:type="dxa" w:w="1234"/>
+            <w:tcW w:type="dxa" w:w="2057"/>
+            <w:vAlign w:val="center"/>
+            <w:tcMar>
+              <w:top w:w="80" w:type="dxa"/>
+              <w:start w:w="100" w:type="dxa"/>
+              <w:bottom w:w="80" w:type="dxa"/>
+              <w:end w:w="100" w:type="dxa"/>
+            </w:tcMar>
           </w:tcPr>
           <w:p>
+            <w:pPr>
+              <w:spacing w:after="0"/>
+            </w:pPr>
             <w:r>
-              <w:t>Ajuste de consultas com ordenação e limite de leitura</w:t>
+              <w:rPr>
+                <w:sz w:val="14"/>
+              </w:rPr>
+              <w:t>Análise de riscos, regras de negócio, critérios de aceite e organização do backlog Kanban</w:t>
             </w:r>
           </w:p>
         </w:tc>
         <w:tc>
           <w:tcPr>
-            <w:tcW w:type="dxa" w:w="1234"/>
+            <w:tcW w:type="dxa" w:w="2057"/>
+            <w:vAlign w:val="center"/>
+            <w:tcMar>
+              <w:top w:w="80" w:type="dxa"/>
+              <w:start w:w="100" w:type="dxa"/>
+              <w:bottom w:w="80" w:type="dxa"/>
+              <w:end w:w="100" w:type="dxa"/>
+            </w:tcMar>
           </w:tcPr>
           <w:p>
+            <w:pPr>
+              <w:spacing w:after="0"/>
+            </w:pPr>
             <w:r>
-              <w:t>README.md</w:t>
+              <w:rPr>
+                <w:sz w:val="14"/>
+              </w:rPr>
+              <w:t>docs/modelagem-site.md</w:t>
             </w:r>
           </w:p>
         </w:tc>
         <w:tc>
           <w:tcPr>
-            <w:tcW w:type="dxa" w:w="1234"/>
+            <w:tcW w:type="dxa" w:w="2057"/>
+            <w:vAlign w:val="center"/>
+            <w:tcMar>
+              <w:top w:w="80" w:type="dxa"/>
+              <w:start w:w="100" w:type="dxa"/>
+              <w:bottom w:w="80" w:type="dxa"/>
+              <w:end w:w="100" w:type="dxa"/>
+            </w:tcMar>
           </w:tcPr>
           <w:p>
+            <w:pPr>
+              <w:spacing w:after="0"/>
+            </w:pPr>
             <w:r>
-              <w:t>Listagens mais estáveis e melhor desempenho</w:t>
+              <w:rPr>
+                <w:sz w:val="14"/>
+              </w:rPr>
+              <w:t>Requisitos priorizados e rastreáveis</w:t>
             </w:r>
           </w:p>
         </w:tc>
@@ -456,71 +799,162 @@
       <w:tr>
         <w:tc>
           <w:tcPr>
-            <w:tcW w:type="dxa" w:w="1234"/>
+            <w:tcW w:type="dxa" w:w="2057"/>
+            <w:vAlign w:val="center"/>
+            <w:tcMar>
+              <w:top w:w="80" w:type="dxa"/>
+              <w:start w:w="100" w:type="dxa"/>
+              <w:bottom w:w="80" w:type="dxa"/>
+              <w:end w:w="100" w:type="dxa"/>
+            </w:tcMar>
           </w:tcPr>
           <w:p>
+            <w:pPr>
+              <w:spacing w:after="0"/>
+            </w:pPr>
             <w:r>
+              <w:rPr>
+                <w:sz w:val="14"/>
+              </w:rPr>
               <w:t>4 - Em andamento</w:t>
             </w:r>
           </w:p>
         </w:tc>
         <w:tc>
           <w:tcPr>
-            <w:tcW w:type="dxa" w:w="1234"/>
+            <w:tcW w:type="dxa" w:w="2057"/>
+            <w:vAlign w:val="center"/>
+            <w:tcMar>
+              <w:top w:w="80" w:type="dxa"/>
+              <w:start w:w="100" w:type="dxa"/>
+              <w:bottom w:w="80" w:type="dxa"/>
+              <w:end w:w="100" w:type="dxa"/>
+            </w:tcMar>
           </w:tcPr>
           <w:p>
+            <w:pPr>
+              <w:spacing w:after="0"/>
+            </w:pPr>
             <w:r>
-              <w:t>Requisitos e modelagem (14 dias)</w:t>
+              <w:rPr>
+                <w:sz w:val="14"/>
+              </w:rPr>
+              <w:t>Versão navegável (8 dias)</w:t>
             </w:r>
           </w:p>
         </w:tc>
         <w:tc>
           <w:tcPr>
-            <w:tcW w:type="dxa" w:w="1234"/>
+            <w:tcW w:type="dxa" w:w="2057"/>
+            <w:vAlign w:val="center"/>
+            <w:tcMar>
+              <w:top w:w="80" w:type="dxa"/>
+              <w:start w:w="100" w:type="dxa"/>
+              <w:bottom w:w="80" w:type="dxa"/>
+              <w:end w:w="100" w:type="dxa"/>
+            </w:tcMar>
           </w:tcPr>
           <w:p>
+            <w:pPr>
+              <w:spacing w:after="0"/>
+            </w:pPr>
             <w:r>
-              <w:t>Reforçar autenticação e fluxos de usuário</w:t>
+              <w:rPr>
+                <w:sz w:val="14"/>
+              </w:rPr>
+              <w:t>Demonstrar os fluxos principais</w:t>
             </w:r>
           </w:p>
         </w:tc>
         <w:tc>
           <w:tcPr>
-            <w:tcW w:type="dxa" w:w="1234"/>
+            <w:tcW w:type="dxa" w:w="2057"/>
+            <w:vAlign w:val="center"/>
+            <w:tcMar>
+              <w:top w:w="80" w:type="dxa"/>
+              <w:start w:w="100" w:type="dxa"/>
+              <w:bottom w:w="80" w:type="dxa"/>
+              <w:end w:w="100" w:type="dxa"/>
+            </w:tcMar>
           </w:tcPr>
           <w:p>
+            <w:pPr>
+              <w:spacing w:after="0"/>
+            </w:pPr>
             <w:r>
-              <w:t>Inconsistências entre primeiro acesso e retorno</w:t>
+              <w:rPr>
+                <w:sz w:val="14"/>
+              </w:rPr>
+              <w:t>Necessidade de visualizar a solução antes da integração completa</w:t>
             </w:r>
           </w:p>
         </w:tc>
         <w:tc>
           <w:tcPr>
-            <w:tcW w:type="dxa" w:w="1234"/>
+            <w:tcW w:type="dxa" w:w="2057"/>
+            <w:vAlign w:val="center"/>
+            <w:tcMar>
+              <w:top w:w="80" w:type="dxa"/>
+              <w:start w:w="100" w:type="dxa"/>
+              <w:bottom w:w="80" w:type="dxa"/>
+              <w:end w:w="100" w:type="dxa"/>
+            </w:tcMar>
           </w:tcPr>
           <w:p>
+            <w:pPr>
+              <w:spacing w:after="0"/>
+            </w:pPr>
             <w:r>
-              <w:t>Ajuste no fluxo de autenticação e navegação</w:t>
+              <w:rPr>
+                <w:sz w:val="14"/>
+              </w:rPr>
+              <w:t>Construção das páginas, navegação, formulários, listagens e mapa inicial</w:t>
             </w:r>
           </w:p>
         </w:tc>
         <w:tc>
           <w:tcPr>
-            <w:tcW w:type="dxa" w:w="1234"/>
+            <w:tcW w:type="dxa" w:w="2057"/>
+            <w:vAlign w:val="center"/>
+            <w:tcMar>
+              <w:top w:w="80" w:type="dxa"/>
+              <w:start w:w="100" w:type="dxa"/>
+              <w:bottom w:w="80" w:type="dxa"/>
+              <w:end w:w="100" w:type="dxa"/>
+            </w:tcMar>
           </w:tcPr>
           <w:p>
+            <w:pPr>
+              <w:spacing w:after="0"/>
+            </w:pPr>
             <w:r>
-              <w:t>README.md</w:t>
+              <w:rPr>
+                <w:sz w:val="14"/>
+              </w:rPr>
+              <w:t>public/ e docs/modelagem-site.md</w:t>
             </w:r>
           </w:p>
         </w:tc>
         <w:tc>
           <w:tcPr>
-            <w:tcW w:type="dxa" w:w="1234"/>
+            <w:tcW w:type="dxa" w:w="2057"/>
+            <w:vAlign w:val="center"/>
+            <w:tcMar>
+              <w:top w:w="80" w:type="dxa"/>
+              <w:start w:w="100" w:type="dxa"/>
+              <w:bottom w:w="80" w:type="dxa"/>
+              <w:end w:w="100" w:type="dxa"/>
+            </w:tcMar>
           </w:tcPr>
           <w:p>
+            <w:pPr>
+              <w:spacing w:after="0"/>
+            </w:pPr>
             <w:r>
-              <w:t>Experiência de acesso mais previsível</w:t>
+              <w:rPr>
+                <w:sz w:val="14"/>
+              </w:rPr>
+              <w:t>Versão navegável disponível</w:t>
             </w:r>
           </w:p>
         </w:tc>
@@ -528,71 +962,162 @@
       <w:tr>
         <w:tc>
           <w:tcPr>
-            <w:tcW w:type="dxa" w:w="1234"/>
+            <w:tcW w:type="dxa" w:w="2057"/>
+            <w:vAlign w:val="center"/>
+            <w:tcMar>
+              <w:top w:w="80" w:type="dxa"/>
+              <w:start w:w="100" w:type="dxa"/>
+              <w:bottom w:w="80" w:type="dxa"/>
+              <w:end w:w="100" w:type="dxa"/>
+            </w:tcMar>
           </w:tcPr>
           <w:p>
+            <w:pPr>
+              <w:spacing w:after="0"/>
+            </w:pPr>
             <w:r>
+              <w:rPr>
+                <w:sz w:val="14"/>
+              </w:rPr>
               <w:t>5 - Em andamento</w:t>
             </w:r>
           </w:p>
         </w:tc>
         <w:tc>
           <w:tcPr>
-            <w:tcW w:type="dxa" w:w="1234"/>
+            <w:tcW w:type="dxa" w:w="2057"/>
+            <w:vAlign w:val="center"/>
+            <w:tcMar>
+              <w:top w:w="80" w:type="dxa"/>
+              <w:start w:w="100" w:type="dxa"/>
+              <w:bottom w:w="80" w:type="dxa"/>
+              <w:end w:w="100" w:type="dxa"/>
+            </w:tcMar>
           </w:tcPr>
           <w:p>
+            <w:pPr>
+              <w:spacing w:after="0"/>
+            </w:pPr>
             <w:r>
-              <w:t>Implementação do protótipo (28 dias)</w:t>
+              <w:rPr>
+                <w:sz w:val="14"/>
+              </w:rPr>
+              <w:t>Implementação e integração tecnológica (28 dias)</w:t>
             </w:r>
           </w:p>
         </w:tc>
         <w:tc>
           <w:tcPr>
-            <w:tcW w:type="dxa" w:w="1234"/>
+            <w:tcW w:type="dxa" w:w="2057"/>
+            <w:vAlign w:val="center"/>
+            <w:tcMar>
+              <w:top w:w="80" w:type="dxa"/>
+              <w:start w:w="100" w:type="dxa"/>
+              <w:bottom w:w="80" w:type="dxa"/>
+              <w:end w:w="100" w:type="dxa"/>
+            </w:tcMar>
           </w:tcPr>
           <w:p>
+            <w:pPr>
+              <w:spacing w:after="0"/>
+            </w:pPr>
             <w:r>
-              <w:t>Reduzir exposição de dados sensíveis</w:t>
+              <w:rPr>
+                <w:sz w:val="14"/>
+              </w:rPr>
+              <w:t>Consolidar a aplicação e reforçar sua segurança</w:t>
             </w:r>
           </w:p>
         </w:tc>
         <w:tc>
           <w:tcPr>
-            <w:tcW w:type="dxa" w:w="1234"/>
+            <w:tcW w:type="dxa" w:w="2057"/>
+            <w:vAlign w:val="center"/>
+            <w:tcMar>
+              <w:top w:w="80" w:type="dxa"/>
+              <w:start w:w="100" w:type="dxa"/>
+              <w:bottom w:w="80" w:type="dxa"/>
+              <w:end w:w="100" w:type="dxa"/>
+            </w:tcMar>
           </w:tcPr>
           <w:p>
+            <w:pPr>
+              <w:spacing w:after="0"/>
+            </w:pPr>
             <w:r>
-              <w:t>Contato público com risco de uso indevido</w:t>
+              <w:rPr>
+                <w:sz w:val="14"/>
+              </w:rPr>
+              <w:t>Necessidade de proteger dados e validar imagens enviadas</w:t>
             </w:r>
           </w:p>
         </w:tc>
         <w:tc>
           <w:tcPr>
-            <w:tcW w:type="dxa" w:w="1234"/>
+            <w:tcW w:type="dxa" w:w="2057"/>
+            <w:vAlign w:val="center"/>
+            <w:tcMar>
+              <w:top w:w="80" w:type="dxa"/>
+              <w:start w:w="100" w:type="dxa"/>
+              <w:bottom w:w="80" w:type="dxa"/>
+              <w:end w:w="100" w:type="dxa"/>
+            </w:tcMar>
           </w:tcPr>
           <w:p>
+            <w:pPr>
+              <w:spacing w:after="0"/>
+            </w:pPr>
             <w:r>
-              <w:t>Proteção de contato com fluxo de confirmação</w:t>
+              <w:rPr>
+                <w:sz w:val="14"/>
+              </w:rPr>
+              <w:t>Implementação de autenticação, regras de segurança, proteção de contato e moderação com Google Cloud Vision SafeSearch</w:t>
             </w:r>
           </w:p>
         </w:tc>
         <w:tc>
           <w:tcPr>
-            <w:tcW w:type="dxa" w:w="1234"/>
+            <w:tcW w:type="dxa" w:w="2057"/>
+            <w:vAlign w:val="center"/>
+            <w:tcMar>
+              <w:top w:w="80" w:type="dxa"/>
+              <w:start w:w="100" w:type="dxa"/>
+              <w:bottom w:w="80" w:type="dxa"/>
+              <w:end w:w="100" w:type="dxa"/>
+            </w:tcMar>
           </w:tcPr>
           <w:p>
+            <w:pPr>
+              <w:spacing w:after="0"/>
+            </w:pPr>
             <w:r>
-              <w:t>README.md e docs/arquitetura.md</w:t>
+              <w:rPr>
+                <w:sz w:val="14"/>
+              </w:rPr>
+              <w:t>README.md, docs/arquitetura.md e histórico do GitHub</w:t>
             </w:r>
           </w:p>
         </w:tc>
         <w:tc>
           <w:tcPr>
-            <w:tcW w:type="dxa" w:w="1234"/>
+            <w:tcW w:type="dxa" w:w="2057"/>
+            <w:vAlign w:val="center"/>
+            <w:tcMar>
+              <w:top w:w="80" w:type="dxa"/>
+              <w:start w:w="100" w:type="dxa"/>
+              <w:bottom w:w="80" w:type="dxa"/>
+              <w:end w:w="100" w:type="dxa"/>
+            </w:tcMar>
           </w:tcPr>
           <w:p>
+            <w:pPr>
+              <w:spacing w:after="0"/>
+            </w:pPr>
             <w:r>
-              <w:t>Maior privacidade sem perder funcionalidade</w:t>
+              <w:rPr>
+                <w:sz w:val="14"/>
+              </w:rPr>
+              <w:t>Aplicação mais segura e preparada para uso demonstrativo</w:t>
             </w:r>
           </w:p>
         </w:tc>
@@ -600,70 +1125,161 @@
       <w:tr>
         <w:tc>
           <w:tcPr>
-            <w:tcW w:type="dxa" w:w="1234"/>
+            <w:tcW w:type="dxa" w:w="2057"/>
+            <w:vAlign w:val="center"/>
+            <w:tcMar>
+              <w:top w:w="80" w:type="dxa"/>
+              <w:start w:w="100" w:type="dxa"/>
+              <w:bottom w:w="80" w:type="dxa"/>
+              <w:end w:w="100" w:type="dxa"/>
+            </w:tcMar>
           </w:tcPr>
           <w:p>
+            <w:pPr>
+              <w:spacing w:after="0"/>
+            </w:pPr>
             <w:r>
+              <w:rPr>
+                <w:sz w:val="14"/>
+              </w:rPr>
               <w:t>6 - Em validação</w:t>
             </w:r>
           </w:p>
         </w:tc>
         <w:tc>
           <w:tcPr>
-            <w:tcW w:type="dxa" w:w="1234"/>
+            <w:tcW w:type="dxa" w:w="2057"/>
+            <w:vAlign w:val="center"/>
+            <w:tcMar>
+              <w:top w:w="80" w:type="dxa"/>
+              <w:start w:w="100" w:type="dxa"/>
+              <w:bottom w:w="80" w:type="dxa"/>
+              <w:end w:w="100" w:type="dxa"/>
+            </w:tcMar>
           </w:tcPr>
           <w:p>
+            <w:pPr>
+              <w:spacing w:after="0"/>
+            </w:pPr>
             <w:r>
+              <w:rPr>
+                <w:sz w:val="14"/>
+              </w:rPr>
               <w:t>Testes funcionais, usabilidade e acessibilidade (14 dias)</w:t>
             </w:r>
           </w:p>
         </w:tc>
         <w:tc>
           <w:tcPr>
-            <w:tcW w:type="dxa" w:w="1234"/>
+            <w:tcW w:type="dxa" w:w="2057"/>
+            <w:vAlign w:val="center"/>
+            <w:tcMar>
+              <w:top w:w="80" w:type="dxa"/>
+              <w:start w:w="100" w:type="dxa"/>
+              <w:bottom w:w="80" w:type="dxa"/>
+              <w:end w:w="100" w:type="dxa"/>
+            </w:tcMar>
           </w:tcPr>
           <w:p>
+            <w:pPr>
+              <w:spacing w:after="0"/>
+            </w:pPr>
             <w:r>
+              <w:rPr>
+                <w:sz w:val="14"/>
+              </w:rPr>
               <w:t>Mapear riscos e respostas do projeto</w:t>
             </w:r>
           </w:p>
         </w:tc>
         <w:tc>
           <w:tcPr>
-            <w:tcW w:type="dxa" w:w="1234"/>
+            <w:tcW w:type="dxa" w:w="2057"/>
+            <w:vAlign w:val="center"/>
+            <w:tcMar>
+              <w:top w:w="80" w:type="dxa"/>
+              <w:start w:w="100" w:type="dxa"/>
+              <w:bottom w:w="80" w:type="dxa"/>
+              <w:end w:w="100" w:type="dxa"/>
+            </w:tcMar>
           </w:tcPr>
           <w:p>
+            <w:pPr>
+              <w:spacing w:after="0"/>
+            </w:pPr>
             <w:r>
+              <w:rPr>
+                <w:sz w:val="14"/>
+              </w:rPr>
               <w:t>Necessidade de formalização de riscos</w:t>
             </w:r>
           </w:p>
         </w:tc>
         <w:tc>
           <w:tcPr>
-            <w:tcW w:type="dxa" w:w="1234"/>
+            <w:tcW w:type="dxa" w:w="2057"/>
+            <w:vAlign w:val="center"/>
+            <w:tcMar>
+              <w:top w:w="80" w:type="dxa"/>
+              <w:start w:w="100" w:type="dxa"/>
+              <w:bottom w:w="80" w:type="dxa"/>
+              <w:end w:w="100" w:type="dxa"/>
+            </w:tcMar>
           </w:tcPr>
           <w:p>
+            <w:pPr>
+              <w:spacing w:after="0"/>
+            </w:pPr>
             <w:r>
+              <w:rPr>
+                <w:sz w:val="14"/>
+              </w:rPr>
               <w:t>Registro de riscos, causas e mitigação</w:t>
             </w:r>
           </w:p>
         </w:tc>
         <w:tc>
           <w:tcPr>
-            <w:tcW w:type="dxa" w:w="1234"/>
+            <w:tcW w:type="dxa" w:w="2057"/>
+            <w:vAlign w:val="center"/>
+            <w:tcMar>
+              <w:top w:w="80" w:type="dxa"/>
+              <w:start w:w="100" w:type="dxa"/>
+              <w:bottom w:w="80" w:type="dxa"/>
+              <w:end w:w="100" w:type="dxa"/>
+            </w:tcMar>
           </w:tcPr>
           <w:p>
+            <w:pPr>
+              <w:spacing w:after="0"/>
+            </w:pPr>
             <w:r>
+              <w:rPr>
+                <w:sz w:val="14"/>
+              </w:rPr>
               <w:t>docs/modelagem-site.md (seção de riscos e mitigações)</w:t>
             </w:r>
           </w:p>
         </w:tc>
         <w:tc>
           <w:tcPr>
-            <w:tcW w:type="dxa" w:w="1234"/>
+            <w:tcW w:type="dxa" w:w="2057"/>
+            <w:vAlign w:val="center"/>
+            <w:tcMar>
+              <w:top w:w="80" w:type="dxa"/>
+              <w:start w:w="100" w:type="dxa"/>
+              <w:bottom w:w="80" w:type="dxa"/>
+              <w:end w:w="100" w:type="dxa"/>
+            </w:tcMar>
           </w:tcPr>
           <w:p>
+            <w:pPr>
+              <w:spacing w:after="0"/>
+            </w:pPr>
             <w:r>
+              <w:rPr>
+                <w:sz w:val="14"/>
+              </w:rPr>
               <w:t>Gestão de riscos documentada</w:t>
             </w:r>
           </w:p>
@@ -672,70 +1288,161 @@
       <w:tr>
         <w:tc>
           <w:tcPr>
-            <w:tcW w:type="dxa" w:w="1234"/>
+            <w:tcW w:type="dxa" w:w="2057"/>
+            <w:vAlign w:val="center"/>
+            <w:tcMar>
+              <w:top w:w="80" w:type="dxa"/>
+              <w:start w:w="100" w:type="dxa"/>
+              <w:bottom w:w="80" w:type="dxa"/>
+              <w:end w:w="100" w:type="dxa"/>
+            </w:tcMar>
           </w:tcPr>
           <w:p>
+            <w:pPr>
+              <w:spacing w:after="0"/>
+            </w:pPr>
             <w:r>
+              <w:rPr>
+                <w:sz w:val="14"/>
+              </w:rPr>
               <w:t>7 - Em validação</w:t>
             </w:r>
           </w:p>
         </w:tc>
         <w:tc>
           <w:tcPr>
-            <w:tcW w:type="dxa" w:w="1234"/>
+            <w:tcW w:type="dxa" w:w="2057"/>
+            <w:vAlign w:val="center"/>
+            <w:tcMar>
+              <w:top w:w="80" w:type="dxa"/>
+              <w:start w:w="100" w:type="dxa"/>
+              <w:bottom w:w="80" w:type="dxa"/>
+              <w:end w:w="100" w:type="dxa"/>
+            </w:tcMar>
           </w:tcPr>
           <w:p>
+            <w:pPr>
+              <w:spacing w:after="0"/>
+            </w:pPr>
             <w:r>
-              <w:t>Publicação e demonstração do protótipo (7 dias)</w:t>
+              <w:rPr>
+                <w:sz w:val="14"/>
+              </w:rPr>
+              <w:t>Publicação e demonstração da aplicação (7 dias)</w:t>
             </w:r>
           </w:p>
         </w:tc>
         <w:tc>
           <w:tcPr>
-            <w:tcW w:type="dxa" w:w="1234"/>
+            <w:tcW w:type="dxa" w:w="2057"/>
+            <w:vAlign w:val="center"/>
+            <w:tcMar>
+              <w:top w:w="80" w:type="dxa"/>
+              <w:start w:w="100" w:type="dxa"/>
+              <w:bottom w:w="80" w:type="dxa"/>
+              <w:end w:w="100" w:type="dxa"/>
+            </w:tcMar>
           </w:tcPr>
           <w:p>
+            <w:pPr>
+              <w:spacing w:after="0"/>
+            </w:pPr>
             <w:r>
+              <w:rPr>
+                <w:sz w:val="14"/>
+              </w:rPr>
               <w:t>Consolidar documentação acadêmica</w:t>
             </w:r>
           </w:p>
         </w:tc>
         <w:tc>
           <w:tcPr>
-            <w:tcW w:type="dxa" w:w="1234"/>
+            <w:tcW w:type="dxa" w:w="2057"/>
+            <w:vAlign w:val="center"/>
+            <w:tcMar>
+              <w:top w:w="80" w:type="dxa"/>
+              <w:start w:w="100" w:type="dxa"/>
+              <w:bottom w:w="80" w:type="dxa"/>
+              <w:end w:w="100" w:type="dxa"/>
+            </w:tcMar>
           </w:tcPr>
           <w:p>
+            <w:pPr>
+              <w:spacing w:after="0"/>
+            </w:pPr>
             <w:r>
+              <w:rPr>
+                <w:sz w:val="14"/>
+              </w:rPr>
               <w:t>Necessidade de evidenciar método e evolução</w:t>
             </w:r>
           </w:p>
         </w:tc>
         <w:tc>
           <w:tcPr>
-            <w:tcW w:type="dxa" w:w="1234"/>
+            <w:tcW w:type="dxa" w:w="2057"/>
+            <w:vAlign w:val="center"/>
+            <w:tcMar>
+              <w:top w:w="80" w:type="dxa"/>
+              <w:start w:w="100" w:type="dxa"/>
+              <w:bottom w:w="80" w:type="dxa"/>
+              <w:end w:w="100" w:type="dxa"/>
+            </w:tcMar>
           </w:tcPr>
           <w:p>
+            <w:pPr>
+              <w:spacing w:after="0"/>
+            </w:pPr>
             <w:r>
+              <w:rPr>
+                <w:sz w:val="14"/>
+              </w:rPr>
               <w:t>Atualização da modelagem por engenharia reversa e alinhamento metodológico</w:t>
             </w:r>
           </w:p>
         </w:tc>
         <w:tc>
           <w:tcPr>
-            <w:tcW w:type="dxa" w:w="1234"/>
+            <w:tcW w:type="dxa" w:w="2057"/>
+            <w:vAlign w:val="center"/>
+            <w:tcMar>
+              <w:top w:w="80" w:type="dxa"/>
+              <w:start w:w="100" w:type="dxa"/>
+              <w:bottom w:w="80" w:type="dxa"/>
+              <w:end w:w="100" w:type="dxa"/>
+            </w:tcMar>
           </w:tcPr>
           <w:p>
+            <w:pPr>
+              <w:spacing w:after="0"/>
+            </w:pPr>
             <w:r>
+              <w:rPr>
+                <w:sz w:val="14"/>
+              </w:rPr>
               <w:t>docs/modelagem-site.md</w:t>
             </w:r>
           </w:p>
         </w:tc>
         <w:tc>
           <w:tcPr>
-            <w:tcW w:type="dxa" w:w="1234"/>
+            <w:tcW w:type="dxa" w:w="2057"/>
+            <w:vAlign w:val="center"/>
+            <w:tcMar>
+              <w:top w:w="80" w:type="dxa"/>
+              <w:start w:w="100" w:type="dxa"/>
+              <w:bottom w:w="80" w:type="dxa"/>
+              <w:end w:w="100" w:type="dxa"/>
+            </w:tcMar>
           </w:tcPr>
           <w:p>
+            <w:pPr>
+              <w:spacing w:after="0"/>
+            </w:pPr>
             <w:r>
+              <w:rPr>
+                <w:sz w:val="14"/>
+              </w:rPr>
               <w:t>Documentação coerente com o sistema implementado</w:t>
             </w:r>
           </w:p>
@@ -744,70 +1451,161 @@
       <w:tr>
         <w:tc>
           <w:tcPr>
-            <w:tcW w:type="dxa" w:w="1234"/>
+            <w:tcW w:type="dxa" w:w="2057"/>
+            <w:vAlign w:val="center"/>
+            <w:tcMar>
+              <w:top w:w="80" w:type="dxa"/>
+              <w:start w:w="100" w:type="dxa"/>
+              <w:bottom w:w="80" w:type="dxa"/>
+              <w:end w:w="100" w:type="dxa"/>
+            </w:tcMar>
           </w:tcPr>
           <w:p>
+            <w:pPr>
+              <w:spacing w:after="0"/>
+            </w:pPr>
             <w:r>
+              <w:rPr>
+                <w:sz w:val="14"/>
+              </w:rPr>
               <w:t>8 - Em validação</w:t>
             </w:r>
           </w:p>
         </w:tc>
         <w:tc>
           <w:tcPr>
-            <w:tcW w:type="dxa" w:w="1234"/>
+            <w:tcW w:type="dxa" w:w="2057"/>
+            <w:vAlign w:val="center"/>
+            <w:tcMar>
+              <w:top w:w="80" w:type="dxa"/>
+              <w:start w:w="100" w:type="dxa"/>
+              <w:bottom w:w="80" w:type="dxa"/>
+              <w:end w:w="100" w:type="dxa"/>
+            </w:tcMar>
           </w:tcPr>
           <w:p>
+            <w:pPr>
+              <w:spacing w:after="0"/>
+            </w:pPr>
             <w:r>
+              <w:rPr>
+                <w:sz w:val="14"/>
+              </w:rPr>
               <w:t>Coleta de feedback comunitário (14 dias)</w:t>
             </w:r>
           </w:p>
         </w:tc>
         <w:tc>
           <w:tcPr>
-            <w:tcW w:type="dxa" w:w="1234"/>
+            <w:tcW w:type="dxa" w:w="2057"/>
+            <w:vAlign w:val="center"/>
+            <w:tcMar>
+              <w:top w:w="80" w:type="dxa"/>
+              <w:start w:w="100" w:type="dxa"/>
+              <w:bottom w:w="80" w:type="dxa"/>
+              <w:end w:w="100" w:type="dxa"/>
+            </w:tcMar>
           </w:tcPr>
           <w:p>
+            <w:pPr>
+              <w:spacing w:after="0"/>
+            </w:pPr>
             <w:r>
+              <w:rPr>
+                <w:sz w:val="14"/>
+              </w:rPr>
               <w:t>Obter retorno de usuários e ONGs</w:t>
             </w:r>
           </w:p>
         </w:tc>
         <w:tc>
           <w:tcPr>
-            <w:tcW w:type="dxa" w:w="1234"/>
+            <w:tcW w:type="dxa" w:w="2057"/>
+            <w:vAlign w:val="center"/>
+            <w:tcMar>
+              <w:top w:w="80" w:type="dxa"/>
+              <w:start w:w="100" w:type="dxa"/>
+              <w:bottom w:w="80" w:type="dxa"/>
+              <w:end w:w="100" w:type="dxa"/>
+            </w:tcMar>
           </w:tcPr>
           <w:p>
+            <w:pPr>
+              <w:spacing w:after="0"/>
+            </w:pPr>
             <w:r>
+              <w:rPr>
+                <w:sz w:val="14"/>
+              </w:rPr>
               <w:t>Necessidade de validar a utilidade prática</w:t>
             </w:r>
           </w:p>
         </w:tc>
         <w:tc>
           <w:tcPr>
-            <w:tcW w:type="dxa" w:w="1234"/>
+            <w:tcW w:type="dxa" w:w="2057"/>
+            <w:vAlign w:val="center"/>
+            <w:tcMar>
+              <w:top w:w="80" w:type="dxa"/>
+              <w:start w:w="100" w:type="dxa"/>
+              <w:bottom w:w="80" w:type="dxa"/>
+              <w:end w:w="100" w:type="dxa"/>
+            </w:tcMar>
           </w:tcPr>
           <w:p>
+            <w:pPr>
+              <w:spacing w:after="0"/>
+            </w:pPr>
             <w:r>
+              <w:rPr>
+                <w:sz w:val="14"/>
+              </w:rPr>
               <w:t>Aplicação de formulário e registro das respostas</w:t>
             </w:r>
           </w:p>
         </w:tc>
         <w:tc>
           <w:tcPr>
-            <w:tcW w:type="dxa" w:w="1234"/>
+            <w:tcW w:type="dxa" w:w="2057"/>
+            <w:vAlign w:val="center"/>
+            <w:tcMar>
+              <w:top w:w="80" w:type="dxa"/>
+              <w:start w:w="100" w:type="dxa"/>
+              <w:bottom w:w="80" w:type="dxa"/>
+              <w:end w:w="100" w:type="dxa"/>
+            </w:tcMar>
           </w:tcPr>
           <w:p>
+            <w:pPr>
+              <w:spacing w:after="0"/>
+            </w:pPr>
             <w:r>
+              <w:rPr>
+                <w:sz w:val="14"/>
+              </w:rPr>
               <w:t>docs/roteiro-google-form-impacto.md</w:t>
             </w:r>
           </w:p>
         </w:tc>
         <w:tc>
           <w:tcPr>
-            <w:tcW w:type="dxa" w:w="1234"/>
+            <w:tcW w:type="dxa" w:w="2057"/>
+            <w:vAlign w:val="center"/>
+            <w:tcMar>
+              <w:top w:w="80" w:type="dxa"/>
+              <w:start w:w="100" w:type="dxa"/>
+              <w:bottom w:w="80" w:type="dxa"/>
+              <w:end w:w="100" w:type="dxa"/>
+            </w:tcMar>
           </w:tcPr>
           <w:p>
+            <w:pPr>
+              <w:spacing w:after="0"/>
+            </w:pPr>
             <w:r>
+              <w:rPr>
+                <w:sz w:val="14"/>
+              </w:rPr>
               <w:t>Feedback organizado para análise</w:t>
             </w:r>
           </w:p>
@@ -816,71 +1614,162 @@
       <w:tr>
         <w:tc>
           <w:tcPr>
-            <w:tcW w:type="dxa" w:w="1234"/>
+            <w:tcW w:type="dxa" w:w="2057"/>
+            <w:vAlign w:val="center"/>
+            <w:tcMar>
+              <w:top w:w="80" w:type="dxa"/>
+              <w:start w:w="100" w:type="dxa"/>
+              <w:bottom w:w="80" w:type="dxa"/>
+              <w:end w:w="100" w:type="dxa"/>
+            </w:tcMar>
           </w:tcPr>
           <w:p>
+            <w:pPr>
+              <w:spacing w:after="0"/>
+            </w:pPr>
             <w:r>
+              <w:rPr>
+                <w:sz w:val="14"/>
+              </w:rPr>
               <w:t>9 - Em validação</w:t>
             </w:r>
           </w:p>
         </w:tc>
         <w:tc>
           <w:tcPr>
-            <w:tcW w:type="dxa" w:w="1234"/>
+            <w:tcW w:type="dxa" w:w="2057"/>
+            <w:vAlign w:val="center"/>
+            <w:tcMar>
+              <w:top w:w="80" w:type="dxa"/>
+              <w:start w:w="100" w:type="dxa"/>
+              <w:bottom w:w="80" w:type="dxa"/>
+              <w:end w:w="100" w:type="dxa"/>
+            </w:tcMar>
           </w:tcPr>
           <w:p>
+            <w:pPr>
+              <w:spacing w:after="0"/>
+            </w:pPr>
             <w:r>
+              <w:rPr>
+                <w:sz w:val="14"/>
+              </w:rPr>
               <w:t>Análise das respostas (5 dias)</w:t>
             </w:r>
           </w:p>
         </w:tc>
         <w:tc>
           <w:tcPr>
-            <w:tcW w:type="dxa" w:w="1234"/>
+            <w:tcW w:type="dxa" w:w="2057"/>
+            <w:vAlign w:val="center"/>
+            <w:tcMar>
+              <w:top w:w="80" w:type="dxa"/>
+              <w:start w:w="100" w:type="dxa"/>
+              <w:bottom w:w="80" w:type="dxa"/>
+              <w:end w:w="100" w:type="dxa"/>
+            </w:tcMar>
           </w:tcPr>
           <w:p>
+            <w:pPr>
+              <w:spacing w:after="0"/>
+            </w:pPr>
             <w:r>
+              <w:rPr>
+                <w:sz w:val="14"/>
+              </w:rPr>
               <w:t>Interpretar os dados coletados</w:t>
             </w:r>
           </w:p>
         </w:tc>
         <w:tc>
           <w:tcPr>
-            <w:tcW w:type="dxa" w:w="1234"/>
+            <w:tcW w:type="dxa" w:w="2057"/>
+            <w:vAlign w:val="center"/>
+            <w:tcMar>
+              <w:top w:w="80" w:type="dxa"/>
+              <w:start w:w="100" w:type="dxa"/>
+              <w:bottom w:w="80" w:type="dxa"/>
+              <w:end w:w="100" w:type="dxa"/>
+            </w:tcMar>
           </w:tcPr>
           <w:p>
+            <w:pPr>
+              <w:spacing w:after="0"/>
+            </w:pPr>
             <w:r>
+              <w:rPr>
+                <w:sz w:val="14"/>
+              </w:rPr>
               <w:t>Necessidade de identificar melhorias prioritárias</w:t>
             </w:r>
           </w:p>
         </w:tc>
         <w:tc>
           <w:tcPr>
-            <w:tcW w:type="dxa" w:w="1234"/>
+            <w:tcW w:type="dxa" w:w="2057"/>
+            <w:vAlign w:val="center"/>
+            <w:tcMar>
+              <w:top w:w="80" w:type="dxa"/>
+              <w:start w:w="100" w:type="dxa"/>
+              <w:bottom w:w="80" w:type="dxa"/>
+              <w:end w:w="100" w:type="dxa"/>
+            </w:tcMar>
           </w:tcPr>
           <w:p>
+            <w:pPr>
+              <w:spacing w:after="0"/>
+            </w:pPr>
             <w:r>
+              <w:rPr>
+                <w:sz w:val="14"/>
+              </w:rPr>
               <w:t>Consolidação e análise dos resultados</w:t>
             </w:r>
           </w:p>
         </w:tc>
         <w:tc>
           <w:tcPr>
-            <w:tcW w:type="dxa" w:w="1234"/>
+            <w:tcW w:type="dxa" w:w="2057"/>
+            <w:vAlign w:val="center"/>
+            <w:tcMar>
+              <w:top w:w="80" w:type="dxa"/>
+              <w:start w:w="100" w:type="dxa"/>
+              <w:bottom w:w="80" w:type="dxa"/>
+              <w:end w:w="100" w:type="dxa"/>
+            </w:tcMar>
           </w:tcPr>
           <w:p>
+            <w:pPr>
+              <w:spacing w:after="0"/>
+            </w:pPr>
             <w:r>
+              <w:rPr>
+                <w:sz w:val="14"/>
+              </w:rPr>
               <w:t>Evidências da coleta e formulário</w:t>
             </w:r>
           </w:p>
         </w:tc>
         <w:tc>
           <w:tcPr>
-            <w:tcW w:type="dxa" w:w="1234"/>
+            <w:tcW w:type="dxa" w:w="2057"/>
+            <w:vAlign w:val="center"/>
+            <w:tcMar>
+              <w:top w:w="80" w:type="dxa"/>
+              <w:start w:w="100" w:type="dxa"/>
+              <w:bottom w:w="80" w:type="dxa"/>
+              <w:end w:w="100" w:type="dxa"/>
+            </w:tcMar>
           </w:tcPr>
           <w:p>
+            <w:pPr>
+              <w:spacing w:after="0"/>
+            </w:pPr>
             <w:r>
-              <w:t>Melhorias priorizadas</w:t>
+              <w:rPr>
+                <w:sz w:val="14"/>
+              </w:rPr>
+              <w:t>Dados organizados para priorização posterior</w:t>
             </w:r>
           </w:p>
         </w:tc>
@@ -888,70 +1777,161 @@
       <w:tr>
         <w:tc>
           <w:tcPr>
-            <w:tcW w:type="dxa" w:w="1234"/>
+            <w:tcW w:type="dxa" w:w="2057"/>
+            <w:vAlign w:val="center"/>
+            <w:tcMar>
+              <w:top w:w="80" w:type="dxa"/>
+              <w:start w:w="100" w:type="dxa"/>
+              <w:bottom w:w="80" w:type="dxa"/>
+              <w:end w:w="100" w:type="dxa"/>
+            </w:tcMar>
           </w:tcPr>
           <w:p>
+            <w:pPr>
+              <w:spacing w:after="0"/>
+            </w:pPr>
             <w:r>
+              <w:rPr>
+                <w:sz w:val="14"/>
+              </w:rPr>
               <w:t>10 - Concluído</w:t>
             </w:r>
           </w:p>
         </w:tc>
         <w:tc>
           <w:tcPr>
-            <w:tcW w:type="dxa" w:w="1234"/>
+            <w:tcW w:type="dxa" w:w="2057"/>
+            <w:vAlign w:val="center"/>
+            <w:tcMar>
+              <w:top w:w="80" w:type="dxa"/>
+              <w:start w:w="100" w:type="dxa"/>
+              <w:bottom w:w="80" w:type="dxa"/>
+              <w:end w:w="100" w:type="dxa"/>
+            </w:tcMar>
           </w:tcPr>
           <w:p>
+            <w:pPr>
+              <w:spacing w:after="0"/>
+            </w:pPr>
             <w:r>
+              <w:rPr>
+                <w:sz w:val="14"/>
+              </w:rPr>
               <w:t>Refinamento e evidências finais (8 dias)</w:t>
             </w:r>
           </w:p>
         </w:tc>
         <w:tc>
           <w:tcPr>
-            <w:tcW w:type="dxa" w:w="1234"/>
+            <w:tcW w:type="dxa" w:w="2057"/>
+            <w:vAlign w:val="center"/>
+            <w:tcMar>
+              <w:top w:w="80" w:type="dxa"/>
+              <w:start w:w="100" w:type="dxa"/>
+              <w:bottom w:w="80" w:type="dxa"/>
+              <w:end w:w="100" w:type="dxa"/>
+            </w:tcMar>
           </w:tcPr>
           <w:p>
+            <w:pPr>
+              <w:spacing w:after="0"/>
+            </w:pPr>
             <w:r>
+              <w:rPr>
+                <w:sz w:val="14"/>
+              </w:rPr>
               <w:t>Consolidar a entrega do projeto</w:t>
             </w:r>
           </w:p>
         </w:tc>
         <w:tc>
           <w:tcPr>
-            <w:tcW w:type="dxa" w:w="1234"/>
+            <w:tcW w:type="dxa" w:w="2057"/>
+            <w:vAlign w:val="center"/>
+            <w:tcMar>
+              <w:top w:w="80" w:type="dxa"/>
+              <w:start w:w="100" w:type="dxa"/>
+              <w:bottom w:w="80" w:type="dxa"/>
+              <w:end w:w="100" w:type="dxa"/>
+            </w:tcMar>
           </w:tcPr>
           <w:p>
+            <w:pPr>
+              <w:spacing w:after="0"/>
+            </w:pPr>
             <w:r>
+              <w:rPr>
+                <w:sz w:val="14"/>
+              </w:rPr>
               <w:t>Necessidade de fechar documentação e ajustes</w:t>
             </w:r>
           </w:p>
         </w:tc>
         <w:tc>
           <w:tcPr>
-            <w:tcW w:type="dxa" w:w="1234"/>
+            <w:tcW w:type="dxa" w:w="2057"/>
+            <w:vAlign w:val="center"/>
+            <w:tcMar>
+              <w:top w:w="80" w:type="dxa"/>
+              <w:start w:w="100" w:type="dxa"/>
+              <w:bottom w:w="80" w:type="dxa"/>
+              <w:end w:w="100" w:type="dxa"/>
+            </w:tcMar>
           </w:tcPr>
           <w:p>
+            <w:pPr>
+              <w:spacing w:after="0"/>
+            </w:pPr>
             <w:r>
+              <w:rPr>
+                <w:sz w:val="14"/>
+              </w:rPr>
               <w:t>Correções finais, atualização documental e organização das evidências</w:t>
             </w:r>
           </w:p>
         </w:tc>
         <w:tc>
           <w:tcPr>
-            <w:tcW w:type="dxa" w:w="1234"/>
+            <w:tcW w:type="dxa" w:w="2057"/>
+            <w:vAlign w:val="center"/>
+            <w:tcMar>
+              <w:top w:w="80" w:type="dxa"/>
+              <w:start w:w="100" w:type="dxa"/>
+              <w:bottom w:w="80" w:type="dxa"/>
+              <w:end w:w="100" w:type="dxa"/>
+            </w:tcMar>
           </w:tcPr>
           <w:p>
+            <w:pPr>
+              <w:spacing w:after="0"/>
+            </w:pPr>
             <w:r>
+              <w:rPr>
+                <w:sz w:val="14"/>
+              </w:rPr>
               <w:t>README.md e documentação do projeto</w:t>
             </w:r>
           </w:p>
         </w:tc>
         <w:tc>
           <w:tcPr>
-            <w:tcW w:type="dxa" w:w="1234"/>
+            <w:tcW w:type="dxa" w:w="2057"/>
+            <w:vAlign w:val="center"/>
+            <w:tcMar>
+              <w:top w:w="80" w:type="dxa"/>
+              <w:start w:w="100" w:type="dxa"/>
+              <w:bottom w:w="80" w:type="dxa"/>
+              <w:end w:w="100" w:type="dxa"/>
+            </w:tcMar>
           </w:tcPr>
           <w:p>
+            <w:pPr>
+              <w:spacing w:after="0"/>
+            </w:pPr>
             <w:r>
+              <w:rPr>
+                <w:sz w:val="14"/>
+              </w:rPr>
               <w:t>Entrega final preparada</w:t>
             </w:r>
           </w:p>
@@ -1007,8 +1987,8 @@
       </w:r>
     </w:p>
     <w:sectPr>
-      <w:pgSz w:w="12240" w:h="15840"/>
-      <w:pgMar w:top="1440" w:right="1800" w:bottom="1440" w:left="1800" w:header="720" w:footer="720" w:gutter="0"/>
+      <w:pgSz w:w="15840" w:h="12240" w:orient="landscape"/>
+      <w:pgMar w:top="720" w:right="720" w:bottom="720" w:left="720" w:header="720" w:footer="720" w:gutter="0"/>
       <w:cols w:space="720"/>
       <w:docGrid w:linePitch="360"/>
     </w:sectPr>

</xml_diff>